<commit_message>
Exclude items 7, 8 from 3EM_LP TRI calibration
Update TRI exclusion criteria for 3EM_LP to remove items 7 and 8 alongside item 5. All three items demonstrate weak discrimination and low point-biserial correlation; items 5 and 8 show evidence of stronger competing alternatives than the official answer key. Updates R script, Python reporting configuration, and regenerates all associated reports and results.
</commit_message>
<xml_diff>
--- a/Piaui/2026/Julho/Relatorios/2EM_MT/Relatorio_Tecnico_2EM_MT_S3_TCM_TRI.docx
+++ b/Piaui/2026/Julho/Relatorios/2EM_MT/Relatorio_Tecnico_2EM_MT_S3_TCM_TRI.docx
@@ -111,7 +111,7 @@
           <w:color w:val="5F6B76"/>
           <w:sz w:val="20"/>
         </w:rPr>
-        <w:t>20 de julho de 2026</w:t>
+        <w:t>21 de julho de 2026</w:t>
       </w:r>
     </w:p>
     <w:p>
@@ -521,7 +521,7 @@
                 <w:color w:val="222222"/>
                 <w:sz w:val="18"/>
               </w:rPr>
-              <w:t>308,7</w:t>
+              <w:t>309,4</w:t>
             </w:r>
           </w:p>
         </w:tc>
@@ -3291,7 +3291,7 @@
                 <w:color w:val="222222"/>
                 <w:sz w:val="18"/>
               </w:rPr>
-              <w:t>308,7</w:t>
+              <w:t>309,4</w:t>
             </w:r>
           </w:p>
         </w:tc>
@@ -3317,7 +3317,7 @@
                 <w:color w:val="222222"/>
                 <w:sz w:val="18"/>
               </w:rPr>
-              <w:t>307,6 a 309,7</w:t>
+              <w:t>308,4 a 310,5</w:t>
             </w:r>
           </w:p>
         </w:tc>
@@ -3343,7 +3343,7 @@
                 <w:color w:val="222222"/>
                 <w:sz w:val="18"/>
               </w:rPr>
-              <w:t>51,7</w:t>
+              <w:t>51,3</w:t>
             </w:r>
           </w:p>
         </w:tc>
@@ -3369,7 +3369,7 @@
                 <w:color w:val="222222"/>
                 <w:sz w:val="18"/>
               </w:rPr>
-              <w:t>301,1</w:t>
+              <w:t>301,9</w:t>
             </w:r>
           </w:p>
         </w:tc>
@@ -3395,7 +3395,7 @@
                 <w:color w:val="222222"/>
                 <w:sz w:val="18"/>
               </w:rPr>
-              <w:t>265,5 a 347,1</w:t>
+              <w:t>266,7 a 347,6</w:t>
             </w:r>
           </w:p>
         </w:tc>
@@ -3421,7 +3421,7 @@
                 <w:color w:val="222222"/>
                 <w:sz w:val="18"/>
               </w:rPr>
-              <w:t>13</w:t>
+              <w:t>12</w:t>
             </w:r>
           </w:p>
         </w:tc>
@@ -3506,7 +3506,7 @@
     </w:p>
     <w:p>
       <w:r>
-        <w:t>A proficiência média estimada foi 308,7, com mediana 301,1 e desvio-padrão EAP de 51,7. A proporção de estudantes na faixa de 350 pontos ou mais foi 23,6%.</w:t>
+        <w:t>A proficiência média estimada foi 309,4, com mediana 301,9 e desvio-padrão EAP de 51,3. A proporção de estudantes na faixa de 350 pontos ou mais foi 23,9%.</w:t>
       </w:r>
     </w:p>
     <w:p>
@@ -3701,7 +3701,7 @@
                 <w:color w:val="222222"/>
                 <w:sz w:val="18"/>
               </w:rPr>
-              <w:t>2, 5, 20</w:t>
+              <w:t>2, 20</w:t>
             </w:r>
           </w:p>
         </w:tc>
@@ -7837,7 +7837,7 @@
                 <w:color w:val="222222"/>
                 <w:sz w:val="18"/>
               </w:rPr>
-              <w:t>1,022</w:t>
+              <w:t>1,028</w:t>
             </w:r>
           </w:p>
         </w:tc>
@@ -7863,7 +7863,7 @@
                 <w:color w:val="222222"/>
                 <w:sz w:val="18"/>
               </w:rPr>
-              <w:t>1,419</w:t>
+              <w:t>1,433</w:t>
             </w:r>
           </w:p>
         </w:tc>
@@ -7889,7 +7889,7 @@
                 <w:color w:val="222222"/>
                 <w:sz w:val="18"/>
               </w:rPr>
-              <w:t>321,0</w:t>
+              <w:t>321,7</w:t>
             </w:r>
           </w:p>
         </w:tc>
@@ -8024,7 +8024,7 @@
                 <w:color w:val="222222"/>
                 <w:sz w:val="18"/>
               </w:rPr>
-              <w:t>4,799</w:t>
+              <w:t>4,820</w:t>
             </w:r>
           </w:p>
         </w:tc>
@@ -8050,7 +8050,7 @@
                 <w:color w:val="222222"/>
                 <w:sz w:val="18"/>
               </w:rPr>
-              <w:t>490,0</w:t>
+              <w:t>491,0</w:t>
             </w:r>
           </w:p>
         </w:tc>
@@ -8159,7 +8159,7 @@
                 <w:color w:val="222222"/>
                 <w:sz w:val="18"/>
               </w:rPr>
-              <w:t>2,266</w:t>
+              <w:t>2,272</w:t>
             </w:r>
           </w:p>
         </w:tc>
@@ -8185,7 +8185,7 @@
                 <w:color w:val="222222"/>
                 <w:sz w:val="18"/>
               </w:rPr>
-              <w:t>2,193</w:t>
+              <w:t>2,198</w:t>
             </w:r>
           </w:p>
         </w:tc>
@@ -8211,7 +8211,7 @@
                 <w:color w:val="222222"/>
                 <w:sz w:val="18"/>
               </w:rPr>
-              <w:t>359,7</w:t>
+              <w:t>359,9</w:t>
             </w:r>
           </w:p>
         </w:tc>
@@ -8237,7 +8237,7 @@
                 <w:color w:val="222222"/>
                 <w:sz w:val="18"/>
               </w:rPr>
-              <w:t>0,239</w:t>
+              <w:t>0,238</w:t>
             </w:r>
           </w:p>
         </w:tc>
@@ -8481,7 +8481,7 @@
                 <w:color w:val="222222"/>
                 <w:sz w:val="18"/>
               </w:rPr>
-              <w:t>0,350</w:t>
+              <w:t>1,429</w:t>
             </w:r>
           </w:p>
         </w:tc>
@@ -8507,7 +8507,7 @@
                 <w:color w:val="222222"/>
                 <w:sz w:val="18"/>
               </w:rPr>
-              <w:t>5,444</w:t>
+              <w:t>4,790</w:t>
             </w:r>
           </w:p>
         </w:tc>
@@ -8533,7 +8533,7 @@
                 <w:color w:val="222222"/>
                 <w:sz w:val="18"/>
               </w:rPr>
-              <w:t>522,2</w:t>
+              <w:t>489,5</w:t>
             </w:r>
           </w:p>
         </w:tc>
@@ -8559,7 +8559,7 @@
                 <w:color w:val="222222"/>
                 <w:sz w:val="18"/>
               </w:rPr>
-              <w:t>0,071</w:t>
+              <w:t>0,180</w:t>
             </w:r>
           </w:p>
         </w:tc>
@@ -8585,7 +8585,7 @@
                 <w:color w:val="222222"/>
                 <w:sz w:val="18"/>
               </w:rPr>
-              <w:t>Sim</w:t>
+              <w:t>Não</w:t>
             </w:r>
           </w:p>
         </w:tc>
@@ -9125,7 +9125,7 @@
                 <w:color w:val="222222"/>
                 <w:sz w:val="18"/>
               </w:rPr>
-              <w:t>2,497</w:t>
+              <w:t>2,489</w:t>
             </w:r>
           </w:p>
         </w:tc>
@@ -9151,7 +9151,7 @@
                 <w:color w:val="222222"/>
                 <w:sz w:val="18"/>
               </w:rPr>
-              <w:t>2,438</w:t>
+              <w:t>2,441</w:t>
             </w:r>
           </w:p>
         </w:tc>
@@ -9177,7 +9177,7 @@
                 <w:color w:val="222222"/>
                 <w:sz w:val="18"/>
               </w:rPr>
-              <w:t>371,9</w:t>
+              <w:t>372,1</w:t>
             </w:r>
           </w:p>
         </w:tc>
@@ -9203,7 +9203,7 @@
                 <w:color w:val="222222"/>
                 <w:sz w:val="18"/>
               </w:rPr>
-              <w:t>0,191</w:t>
+              <w:t>0,190</w:t>
             </w:r>
           </w:p>
         </w:tc>
@@ -9312,7 +9312,7 @@
                 <w:color w:val="222222"/>
                 <w:sz w:val="18"/>
               </w:rPr>
-              <w:t>2,471</w:t>
+              <w:t>2,475</w:t>
             </w:r>
           </w:p>
         </w:tc>
@@ -9338,7 +9338,7 @@
                 <w:color w:val="222222"/>
                 <w:sz w:val="18"/>
               </w:rPr>
-              <w:t>373,6</w:t>
+              <w:t>373,7</w:t>
             </w:r>
           </w:p>
         </w:tc>
@@ -9364,7 +9364,7 @@
                 <w:color w:val="222222"/>
                 <w:sz w:val="18"/>
               </w:rPr>
-              <w:t>0,181</w:t>
+              <w:t>0,179</w:t>
             </w:r>
           </w:p>
         </w:tc>
@@ -10252,7 +10252,7 @@
                 <w:color w:val="222222"/>
                 <w:sz w:val="18"/>
               </w:rPr>
-              <w:t>2,666</w:t>
+              <w:t>2,665</w:t>
             </w:r>
           </w:p>
         </w:tc>
@@ -10278,7 +10278,7 @@
                 <w:color w:val="222222"/>
                 <w:sz w:val="18"/>
               </w:rPr>
-              <w:t>2,364</w:t>
+              <w:t>2,368</w:t>
             </w:r>
           </w:p>
         </w:tc>
@@ -10304,7 +10304,7 @@
                 <w:color w:val="222222"/>
                 <w:sz w:val="18"/>
               </w:rPr>
-              <w:t>368,2</w:t>
+              <w:t>368,4</w:t>
             </w:r>
           </w:p>
         </w:tc>
@@ -10330,7 +10330,7 @@
                 <w:color w:val="222222"/>
                 <w:sz w:val="18"/>
               </w:rPr>
-              <w:t>0,163</w:t>
+              <w:t>0,162</w:t>
             </w:r>
           </w:p>
         </w:tc>
@@ -10439,7 +10439,7 @@
                 <w:color w:val="222222"/>
                 <w:sz w:val="18"/>
               </w:rPr>
-              <w:t>3,555</w:t>
+              <w:t>3,558</w:t>
             </w:r>
           </w:p>
         </w:tc>
@@ -10465,7 +10465,7 @@
                 <w:color w:val="222222"/>
                 <w:sz w:val="18"/>
               </w:rPr>
-              <w:t>427,8</w:t>
+              <w:t>427,9</w:t>
             </w:r>
           </w:p>
         </w:tc>
@@ -10491,7 +10491,7 @@
                 <w:color w:val="222222"/>
                 <w:sz w:val="18"/>
               </w:rPr>
-              <w:t>0,198</w:t>
+              <w:t>0,197</w:t>
             </w:r>
           </w:p>
         </w:tc>
@@ -10896,7 +10896,7 @@
                 <w:color w:val="222222"/>
                 <w:sz w:val="18"/>
               </w:rPr>
-              <w:t>0,315</w:t>
+              <w:t>0,317</w:t>
             </w:r>
           </w:p>
         </w:tc>
@@ -10922,7 +10922,7 @@
                 <w:color w:val="222222"/>
                 <w:sz w:val="18"/>
               </w:rPr>
-              <w:t>4,433</w:t>
+              <w:t>4,417</w:t>
             </w:r>
           </w:p>
         </w:tc>
@@ -10948,7 +10948,7 @@
                 <w:color w:val="222222"/>
                 <w:sz w:val="18"/>
               </w:rPr>
-              <w:t>471,7</w:t>
+              <w:t>470,8</w:t>
             </w:r>
           </w:p>
         </w:tc>
@@ -10974,7 +10974,7 @@
                 <w:color w:val="222222"/>
                 <w:sz w:val="18"/>
               </w:rPr>
-              <w:t>0,063</w:t>
+              <w:t>0,062</w:t>
             </w:r>
           </w:p>
         </w:tc>
@@ -11057,7 +11057,7 @@
                 <w:color w:val="222222"/>
                 <w:sz w:val="18"/>
               </w:rPr>
-              <w:t>1,225</w:t>
+              <w:t>1,245</w:t>
             </w:r>
           </w:p>
         </w:tc>
@@ -11083,7 +11083,7 @@
                 <w:color w:val="222222"/>
                 <w:sz w:val="18"/>
               </w:rPr>
-              <w:t>3,805</w:t>
+              <w:t>3,795</w:t>
             </w:r>
           </w:p>
         </w:tc>
@@ -11109,7 +11109,7 @@
                 <w:color w:val="222222"/>
                 <w:sz w:val="18"/>
               </w:rPr>
-              <w:t>440,2</w:t>
+              <w:t>439,7</w:t>
             </w:r>
           </w:p>
         </w:tc>
@@ -11218,7 +11218,7 @@
                 <w:color w:val="222222"/>
                 <w:sz w:val="18"/>
               </w:rPr>
-              <w:t>1,251</w:t>
+              <w:t>1,256</w:t>
             </w:r>
           </w:p>
         </w:tc>
@@ -11296,7 +11296,7 @@
                 <w:color w:val="222222"/>
                 <w:sz w:val="18"/>
               </w:rPr>
-              <w:t>0,211</w:t>
+              <w:t>0,210</w:t>
             </w:r>
           </w:p>
         </w:tc>
@@ -11379,7 +11379,7 @@
                 <w:color w:val="222222"/>
                 <w:sz w:val="18"/>
               </w:rPr>
-              <w:t>0,702</w:t>
+              <w:t>0,698</w:t>
             </w:r>
           </w:p>
         </w:tc>
@@ -11405,7 +11405,7 @@
                 <w:color w:val="222222"/>
                 <w:sz w:val="18"/>
               </w:rPr>
-              <w:t>2,156</w:t>
+              <w:t>2,144</w:t>
             </w:r>
           </w:p>
         </w:tc>
@@ -11431,7 +11431,7 @@
                 <w:color w:val="222222"/>
                 <w:sz w:val="18"/>
               </w:rPr>
-              <w:t>357,8</w:t>
+              <w:t>357,2</w:t>
             </w:r>
           </w:p>
         </w:tc>
@@ -11457,7 +11457,7 @@
                 <w:color w:val="222222"/>
                 <w:sz w:val="18"/>
               </w:rPr>
-              <w:t>0,087</w:t>
+              <w:t>0,081</w:t>
             </w:r>
           </w:p>
         </w:tc>
@@ -11540,7 +11540,7 @@
                 <w:color w:val="222222"/>
                 <w:sz w:val="18"/>
               </w:rPr>
-              <w:t>4,350</w:t>
+              <w:t>4,343</w:t>
             </w:r>
           </w:p>
         </w:tc>
@@ -11566,7 +11566,7 @@
                 <w:color w:val="222222"/>
                 <w:sz w:val="18"/>
               </w:rPr>
-              <w:t>2,702</w:t>
+              <w:t>2,707</w:t>
             </w:r>
           </w:p>
         </w:tc>
@@ -11592,7 +11592,7 @@
                 <w:color w:val="222222"/>
                 <w:sz w:val="18"/>
               </w:rPr>
-              <w:t>385,1</w:t>
+              <w:t>385,4</w:t>
             </w:r>
           </w:p>
         </w:tc>
@@ -11618,7 +11618,7 @@
                 <w:color w:val="222222"/>
                 <w:sz w:val="18"/>
               </w:rPr>
-              <w:t>0,224</w:t>
+              <w:t>0,223</w:t>
             </w:r>
           </w:p>
         </w:tc>
@@ -11701,7 +11701,7 @@
                 <w:color w:val="222222"/>
                 <w:sz w:val="18"/>
               </w:rPr>
-              <w:t>2,529</w:t>
+              <w:t>2,519</w:t>
             </w:r>
           </w:p>
         </w:tc>
@@ -11727,7 +11727,7 @@
                 <w:color w:val="222222"/>
                 <w:sz w:val="18"/>
               </w:rPr>
-              <w:t>2,671</w:t>
+              <w:t>2,675</w:t>
             </w:r>
           </w:p>
         </w:tc>
@@ -11753,7 +11753,7 @@
                 <w:color w:val="222222"/>
                 <w:sz w:val="18"/>
               </w:rPr>
-              <w:t>383,6</w:t>
+              <w:t>383,8</w:t>
             </w:r>
           </w:p>
         </w:tc>
@@ -12818,7 +12818,7 @@
                 <w:color w:val="222222"/>
                 <w:sz w:val="18"/>
               </w:rPr>
-              <w:t>4.109</w:t>
+              <w:t>3.823</w:t>
             </w:r>
           </w:p>
         </w:tc>
@@ -12844,7 +12844,7 @@
                 <w:color w:val="222222"/>
                 <w:sz w:val="18"/>
               </w:rPr>
-              <w:t>13,387%</w:t>
+              <w:t>12,456%</w:t>
             </w:r>
           </w:p>
         </w:tc>
@@ -12901,7 +12901,7 @@
                 <w:color w:val="222222"/>
                 <w:sz w:val="18"/>
               </w:rPr>
-              <w:t>5.831</w:t>
+              <w:t>5.869</w:t>
             </w:r>
           </w:p>
         </w:tc>
@@ -12927,7 +12927,7 @@
                 <w:color w:val="222222"/>
                 <w:sz w:val="18"/>
               </w:rPr>
-              <w:t>18,998%</w:t>
+              <w:t>19,122%</w:t>
             </w:r>
           </w:p>
         </w:tc>
@@ -12984,7 +12984,7 @@
                 <w:color w:val="222222"/>
                 <w:sz w:val="18"/>
               </w:rPr>
-              <w:t>5.209</w:t>
+              <w:t>5.293</w:t>
             </w:r>
           </w:p>
         </w:tc>
@@ -13010,7 +13010,7 @@
                 <w:color w:val="222222"/>
                 <w:sz w:val="18"/>
               </w:rPr>
-              <w:t>16,971%</w:t>
+              <w:t>17,245%</w:t>
             </w:r>
           </w:p>
         </w:tc>
@@ -13067,7 +13067,7 @@
                 <w:color w:val="222222"/>
                 <w:sz w:val="18"/>
               </w:rPr>
-              <w:t>4.525</w:t>
+              <w:t>4.581</w:t>
             </w:r>
           </w:p>
         </w:tc>
@@ -13093,7 +13093,7 @@
                 <w:color w:val="222222"/>
                 <w:sz w:val="18"/>
               </w:rPr>
-              <w:t>14,743%</w:t>
+              <w:t>14,925%</w:t>
             </w:r>
           </w:p>
         </w:tc>
@@ -13150,7 +13150,7 @@
                 <w:color w:val="222222"/>
                 <w:sz w:val="18"/>
               </w:rPr>
-              <w:t>3.763</w:t>
+              <w:t>3.783</w:t>
             </w:r>
           </w:p>
         </w:tc>
@@ -13176,7 +13176,7 @@
                 <w:color w:val="222222"/>
                 <w:sz w:val="18"/>
               </w:rPr>
-              <w:t>12,260%</w:t>
+              <w:t>12,325%</w:t>
             </w:r>
           </w:p>
         </w:tc>
@@ -13233,7 +13233,7 @@
                 <w:color w:val="222222"/>
                 <w:sz w:val="18"/>
               </w:rPr>
-              <w:t>7.256</w:t>
+              <w:t>7.344</w:t>
             </w:r>
           </w:p>
         </w:tc>
@@ -13259,7 +13259,7 @@
                 <w:color w:val="222222"/>
                 <w:sz w:val="18"/>
               </w:rPr>
-              <w:t>23,641%</w:t>
+              <w:t>23,927%</w:t>
             </w:r>
           </w:p>
         </w:tc>

</xml_diff>